<commit_message>
1000 reports per minute - done template where to store -done query and connector different microservice -1  done update functionality for all resource -1 - done password to be saved in vault -1  done conector update all details - done test report generation with multiple query placeholders - done external service wants to generate report by calling generate report api, having multiple query placeholders - done excel template test - 1 template versioning - done Database independent datatypes - done
</commit_message>
<xml_diff>
--- a/PublishingV2demo.docx
+++ b/PublishingV2demo.docx
@@ -4,12 +4,36 @@
   <w:body>
     <w:p>
       <w:r>
-        <w:t>Quarterly Report for &lt;&lt;[company.first().company_name]&gt;&gt;</w:t>
+        <w:t>Quarterly Report for &lt;&lt;[</w:t>
+      </w:r>
+      <w:proofErr w:type="spellStart"/>
+      <w:r>
+        <w:t>company.first</w:t>
+      </w:r>
+      <w:proofErr w:type="spellEnd"/>
+      <w:r>
+        <w:t>().</w:t>
+      </w:r>
+      <w:proofErr w:type="spellStart"/>
+      <w:r>
+        <w:t>company_name</w:t>
+      </w:r>
+      <w:proofErr w:type="spellEnd"/>
+      <w:r>
+        <w:t>]&gt;&gt;</w:t>
       </w:r>
     </w:p>
     <w:p>
       <w:r>
-        <w:t>Reporting Quarter: &lt;&lt;[company.first().quarter]&gt;&gt;</w:t>
+        <w:t>Reporting Quarter: &lt;&lt;[</w:t>
+      </w:r>
+      <w:proofErr w:type="spellStart"/>
+      <w:r>
+        <w:t>company.first</w:t>
+      </w:r>
+      <w:proofErr w:type="spellEnd"/>
+      <w:r>
+        <w:t>().quarter]&gt;&gt;</w:t>
       </w:r>
     </w:p>
     <w:p/>
@@ -31,7 +55,129 @@
         <w:spacing w:after="0"/>
       </w:pPr>
       <w:r>
-        <w:t>&lt;&lt;[h.highlight]&gt;&gt;</w:t>
+        <w:rPr>
+          <w:noProof/>
+        </w:rPr>
+        <mc:AlternateContent>
+          <mc:Choice Requires="wps">
+            <w:drawing>
+              <wp:inline distT="0" distB="0" distL="0" distR="0" wp14:anchorId="0F0D0AE2" wp14:editId="4980F291">
+                <wp:extent cx="2392680" cy="386080"/>
+                <wp:effectExtent l="0" t="0" r="26670" b="13970"/>
+                <wp:docPr id="1657909325" name="Rectangle 1"/>
+                <wp:cNvGraphicFramePr/>
+                <a:graphic xmlns:a="http://schemas.openxmlformats.org/drawingml/2006/main">
+                  <a:graphicData uri="http://schemas.microsoft.com/office/word/2010/wordprocessingShape">
+                    <wps:wsp>
+                      <wps:cNvSpPr/>
+                      <wps:spPr>
+                        <a:xfrm>
+                          <a:off x="0" y="0"/>
+                          <a:ext cx="2392680" cy="386080"/>
+                        </a:xfrm>
+                        <a:prstGeom prst="ellipse">
+                          <a:avLst/>
+                        </a:prstGeom>
+                      </wps:spPr>
+                      <wps:style>
+                        <a:lnRef idx="2">
+                          <a:schemeClr val="accent1">
+                            <a:shade val="15000"/>
+                          </a:schemeClr>
+                        </a:lnRef>
+                        <a:fillRef idx="1">
+                          <a:schemeClr val="accent1"/>
+                        </a:fillRef>
+                        <a:effectRef idx="0">
+                          <a:schemeClr val="accent1"/>
+                        </a:effectRef>
+                        <a:fontRef idx="minor">
+                          <a:schemeClr val="lt1"/>
+                        </a:fontRef>
+                      </wps:style>
+                      <wps:txbx>
+                        <w:txbxContent>
+                          <w:p>
+                            <w:pPr>
+                              <w:jc w:val="center"/>
+                            </w:pPr>
+                            <w:r>
+                              <w:t>&lt;&lt;[</w:t>
+                            </w:r>
+                            <w:proofErr w:type="spellStart"/>
+                            <w:r>
+                              <w:t>h.highlight</w:t>
+                            </w:r>
+                            <w:proofErr w:type="spellEnd"/>
+                            <w:r>
+                              <w:t>]&gt;</w:t>
+                            </w:r>
+                            <w:r>
+                              <w:t>&gt;</w:t>
+                            </w:r>
+                          </w:p>
+                        </w:txbxContent>
+                      </wps:txbx>
+                      <wps:bodyPr rot="0" spcFirstLastPara="0" vertOverflow="overflow" horzOverflow="overflow" vert="horz" wrap="square" lIns="91440" tIns="45720" rIns="91440" bIns="45720" numCol="1" spcCol="0" rtlCol="0" fromWordArt="0" anchor="ctr" anchorCtr="0" forceAA="0" compatLnSpc="1">
+                        <a:prstTxWarp prst="textNoShape">
+                          <a:avLst/>
+                        </a:prstTxWarp>
+                        <a:noAutofit/>
+                      </wps:bodyPr>
+                    </wps:wsp>
+                  </a:graphicData>
+                </a:graphic>
+              </wp:inline>
+            </w:drawing>
+          </mc:Choice>
+          <mc:Fallback>
+            <w:pict>
+              <v:oval w14:anchorId="0F0D0AE2" id="Rectangle 1" o:spid="_x0000_s1026" style="width:188.4pt;height:30.4pt;visibility:visible;mso-wrap-style:square;mso-left-percent:-10001;mso-top-percent:-10001;mso-position-horizontal:absolute;mso-position-horizontal-relative:char;mso-position-vertical:absolute;mso-position-vertical-relative:line;mso-left-percent:-10001;mso-top-percent:-10001;v-text-anchor:middle" o:gfxdata="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" fillcolor="#4472c4 [3204]" strokecolor="#09101d [484]" strokeweight="1pt">
+                <v:stroke joinstyle="miter"/>
+                <v:textbox>
+                  <w:txbxContent>
+                    <w:p>
+                      <w:pPr>
+                        <w:jc w:val="center"/>
+                      </w:pPr>
+                      <w:r>
+                        <w:t>&lt;&lt;[</w:t>
+                      </w:r>
+                      <w:proofErr w:type="spellStart"/>
+                      <w:proofErr w:type="gramStart"/>
+                      <w:r>
+                        <w:t>h.highlight</w:t>
+                      </w:r>
+                      <w:proofErr w:type="spellEnd"/>
+                      <w:proofErr w:type="gramEnd"/>
+                      <w:r>
+                        <w:t>]&gt;</w:t>
+                      </w:r>
+                      <w:r>
+                        <w:t>&gt;</w:t>
+                      </w:r>
+                    </w:p>
+                  </w:txbxContent>
+                </v:textbox>
+                <w10:anchorlock/>
+              </v:oval>
+            </w:pict>
+          </mc:Fallback>
+        </mc:AlternateContent>
+      </w:r>
+      <w:r>
+        <w:t>&lt;&lt;[</w:t>
+      </w:r>
+      <w:proofErr w:type="spellStart"/>
+      <w:r>
+        <w:t>h.highlight</w:t>
+      </w:r>
+      <w:proofErr w:type="spellEnd"/>
+      <w:r>
+        <w:t>]&gt;&gt;</w:t>
+      </w:r>
+      <w:r>
+        <w:t xml:space="preserve"> </w:t>
       </w:r>
     </w:p>
     <w:p>
@@ -59,7 +205,17 @@
             <w:tcW w:w="4508" w:type="dxa"/>
           </w:tcPr>
           <w:p>
+            <w:pPr>
+              <w:rPr>
+                <w:b/>
+                <w:bCs/>
+              </w:rPr>
+            </w:pPr>
             <w:r>
+              <w:rPr>
+                <w:b/>
+                <w:bCs/>
+              </w:rPr>
               <w:t>Category</w:t>
             </w:r>
           </w:p>
@@ -69,7 +225,17 @@
             <w:tcW w:w="4508" w:type="dxa"/>
           </w:tcPr>
           <w:p>
+            <w:pPr>
+              <w:rPr>
+                <w:b/>
+                <w:bCs/>
+              </w:rPr>
+            </w:pPr>
             <w:r>
+              <w:rPr>
+                <w:b/>
+                <w:bCs/>
+              </w:rPr>
               <w:t>Revenue</w:t>
             </w:r>
           </w:p>
@@ -82,7 +248,15 @@
           </w:tcPr>
           <w:p>
             <w:r>
-              <w:t>&lt;&lt;foreach [s in sales]&gt;&gt;&lt;&lt;[s.category]&gt;&gt;</w:t>
+              <w:t>&lt;&lt;foreach [s in sales]&gt;&gt;&lt;&lt;[</w:t>
+            </w:r>
+            <w:proofErr w:type="spellStart"/>
+            <w:r>
+              <w:t>s.category</w:t>
+            </w:r>
+            <w:proofErr w:type="spellEnd"/>
+            <w:r>
+              <w:t>]&gt;&gt;</w:t>
             </w:r>
           </w:p>
         </w:tc>
@@ -92,7 +266,64 @@
           </w:tcPr>
           <w:p>
             <w:r>
-              <w:t>&lt;&lt;[s.revenue]&gt;&gt;&lt;&lt;/foreach&gt;&gt;</w:t>
+              <w:t>&lt;&lt;if [</w:t>
+            </w:r>
+            <w:proofErr w:type="spellStart"/>
+            <w:r>
+              <w:t>s.revenue</w:t>
+            </w:r>
+            <w:proofErr w:type="spellEnd"/>
+            <w:r>
+              <w:t xml:space="preserve"> &gt; 1000]&gt;&gt;</w:t>
+            </w:r>
+            <w:r>
+              <w:rPr>
+                <w:highlight w:val="green"/>
+              </w:rPr>
+              <w:t>High Performance: &lt;&lt;[</w:t>
+            </w:r>
+            <w:proofErr w:type="spellStart"/>
+            <w:r>
+              <w:rPr>
+                <w:highlight w:val="green"/>
+              </w:rPr>
+              <w:t>s.revenue</w:t>
+            </w:r>
+            <w:proofErr w:type="spellEnd"/>
+            <w:r>
+              <w:rPr>
+                <w:highlight w:val="green"/>
+              </w:rPr>
+              <w:t>]&gt;&gt;</w:t>
+            </w:r>
+            <w:r>
+              <w:t>&lt;&lt;else&gt;&gt;</w:t>
+            </w:r>
+            <w:r>
+              <w:rPr>
+                <w:color w:val="EE0000"/>
+              </w:rPr>
+              <w:t>Standard: &lt;&lt;[</w:t>
+            </w:r>
+            <w:proofErr w:type="spellStart"/>
+            <w:r>
+              <w:rPr>
+                <w:color w:val="EE0000"/>
+              </w:rPr>
+              <w:t>s.revenue</w:t>
+            </w:r>
+            <w:proofErr w:type="spellEnd"/>
+            <w:r>
+              <w:rPr>
+                <w:color w:val="EE0000"/>
+              </w:rPr>
+              <w:t>]&gt;&gt;</w:t>
+            </w:r>
+            <w:r>
+              <w:t>&lt;&lt;/if&gt;&gt;</w:t>
+            </w:r>
+            <w:r>
+              <w:t>&lt;&lt;/foreach&gt;&gt;</w:t>
             </w:r>
           </w:p>
         </w:tc>
@@ -173,7 +404,15 @@
           </w:tcPr>
           <w:p>
             <w:r>
-              <w:t>Address - &lt;&lt;[u.address]&gt;&gt;</w:t>
+              <w:t>Address - &lt;&lt;[</w:t>
+            </w:r>
+            <w:proofErr w:type="spellStart"/>
+            <w:r>
+              <w:t>u.address</w:t>
+            </w:r>
+            <w:proofErr w:type="spellEnd"/>
+            <w:r>
+              <w:t>]&gt;&gt;</w:t>
             </w:r>
           </w:p>
         </w:tc>
@@ -210,7 +449,7 @@
           <w:noProof/>
         </w:rPr>
         <w:drawing>
-          <wp:inline distT="0" distB="0" distL="0" distR="0" wp14:anchorId="4010BE83" wp14:editId="3DBF7635">
+          <wp:inline distT="0" distB="0" distL="0" distR="0" wp14:anchorId="4010BE83" wp14:editId="47D76936">
             <wp:extent cx="5486400" cy="3200400"/>
             <wp:effectExtent l="0" t="0" r="0" b="0"/>
             <wp:docPr id="1583815772" name="Chart 1"/>
@@ -234,7 +473,6 @@
         <w:rPr>
           <w:noProof/>
         </w:rPr>
-        <w:lastRenderedPageBreak/>
         <w:drawing>
           <wp:inline distT="0" distB="0" distL="0" distR="0" wp14:anchorId="17F05CA0" wp14:editId="6D9284A4">
             <wp:extent cx="5486400" cy="3200400"/>

</xml_diff>